<commit_message>
Complete bibliographic details for preprints; cite arXiv paper instead of blog post
Co-Authored-By: Claude Sonnet 5.5 <noreply@anthropic.com>
Claude-Session: https://claude.ai/code/session_01UvKcabfwJpaPKKhavR8Tdw
</commit_message>
<xml_diff>
--- a/ISR_Digital_Twins_v4_validity_regions.docx
+++ b/ISR_Digital_Twins_v4_validity_regions.docx
@@ -237,7 +237,7 @@
           <w:sz w:val="24"/>
           <w:szCs w:val="24"/>
         </w:rPr>
-        <w:t xml:space="preserve">Prior work establishes that LLMs can reproduce the direction of many classic effects (Horton et al. 2023, Aher et al. 2023), that fine-tuning on behavioral corpora improves prediction (Binz et al. 2025), and that individual-level twin predictions are weak and twins act as hyper-rational agents (Peng et al. 2026). Recent work argues that simulations should be validated against held-out human data because memorization and bias threaten validity (Hullman et al. 2026), and that behavioral fidelity does not by itself imply that twins can reduce the need for human measurement (Wang et al. 2026). Independent reports on the Upworthy archive find weak accuracy for LLM click prediction and that persona conditioning does not help (Spotify Engineering 2026, Synthetic Personas Preprint 2026; see Section 4.4). Our account is complementary: it specifies conditions on the effect and the agent that predict where validity should hold, and it tests those predictions.</w:t>
+        <w:t xml:space="preserve">Prior work establishes that LLMs can reproduce the direction of many classic effects (Horton et al. 2023, Aher et al. 2023), that fine-tuning on behavioral corpora improves prediction (Binz et al. 2025), and that individual-level twin predictions are weak and twins act as hyper-rational agents (Peng et al. 2026). Recent work argues that simulations should be validated against held-out human data because memorization and bias threaten validity (Hullman et al. 2026), and that behavioral fidelity does not by itself imply that twins can reduce the need for human measurement (Wang et al. 2026). Independent reports on the Upworthy archive find weak accuracy for LLM click prediction and that persona conditioning does not help (Persson et al. 2026, Maiorano 2026; see Section 4.4). Our account is complementary: it specifies conditions on the effect and the agent that predict where validity should hold, and it tests those predictions.</w:t>
       </w:r>
     </w:p>
     <w:p>
@@ -7551,7 +7551,7 @@
           <w:sz w:val="24"/>
           <w:szCs w:val="24"/>
         </w:rPr>
-        <w:t xml:space="preserve">The field test used 999 eligible tests from the confirmatory package, of which 833 were classified as cue-contrast tests by the fixed lexical rule and 166 as non-cue tests; 528 tests had arms that differed at p &lt; .05. Table 7 reports the registered verdicts. Without a persona, twin predictions identify the winning headline more often than chance. Excess agreement over the test-specific chance rate is +9.3 percentage points (interval 6.6 to 12.1) and the sign holds in all five models. With demographic personas, excess agreement is about zero, so the no-persona arm outperforms the persona arm by 8.9 points (interval 6.5 to 11.6). This agrees with independent reports that persona conditioning does not help for headline prediction (Spotify Engineering 2026, Synthetic Personas Preprint 2026).</w:t>
+        <w:t xml:space="preserve">The field test used 999 eligible tests from the confirmatory package, of which 833 were classified as cue-contrast tests by the fixed lexical rule and 166 as non-cue tests; 528 tests had arms that differed at p &lt; .05. Table 7 reports the registered verdicts. Without a persona, twin predictions identify the winning headline more often than chance. Excess agreement over the test-specific chance rate is +9.3 percentage points (interval 6.6 to 12.1) and the sign holds in all five models. With demographic personas, excess agreement is about zero, so the no-persona arm outperforms the persona arm by 8.9 points (interval 6.5 to 11.6). This agrees with independent reports that persona conditioning does not help for headline prediction (Persson et al. 2026, Maiorano 2026).</w:t>
       </w:r>
     </w:p>
     <w:p>
@@ -9800,7 +9800,7 @@
           <w:sz w:val="24"/>
           <w:szCs w:val="24"/>
         </w:rPr>
-        <w:t xml:space="preserve">Hullman J, et al. (2026) Validating LLM simulations as behavioral evidence. Preprint, arXiv:2602.15785. [author list to be completed]</w:t>
+        <w:t xml:space="preserve">Hullman J, Broska D, Sun H, Shaw A (2026) This human study did not involve human subjects: Validating LLM simulations as behavioral evidence. Preprint, arXiv:2602.15785.</w:t>
       </w:r>
     </w:p>
     <w:p>
@@ -9856,7 +9856,7 @@
           <w:sz w:val="24"/>
           <w:szCs w:val="24"/>
         </w:rPr>
-        <w:t xml:space="preserve">Matias JN, Munger K, Aubin Le Quere M, Ebersole C (2021) The Upworthy Research Archive, a time series of 32,487 experiments in U.S. media. Scientific Data 8:195.</w:t>
+        <w:t xml:space="preserve">Maiorano AC (2026) Do synthetic personas predict real audience response? A sim-to-real study where a no-persona baseline beats persona-based copy simulation. Preprint, arXiv:2609.25010.</w:t>
       </w:r>
     </w:p>
     <w:p>
@@ -9870,7 +9870,7 @@
           <w:sz w:val="24"/>
           <w:szCs w:val="24"/>
         </w:rPr>
-        <w:t xml:space="preserve">Peng T, Gui G, Brucks M, et al. (2026) Digital twins are funhouse mirrors: Five systematic distortions. Preprint, arXiv:2509.19088.</w:t>
+        <w:t xml:space="preserve">Matias JN, Munger K, Aubin Le Quere M, Ebersole C (2021) The Upworthy Research Archive, a time series of 32,487 experiments in U.S. media. Scientific Data 8:195.</w:t>
       </w:r>
     </w:p>
     <w:p>
@@ -9884,7 +9884,7 @@
           <w:sz w:val="24"/>
           <w:szCs w:val="24"/>
         </w:rPr>
-        <w:t xml:space="preserve">Spotify Engineering (2026) When can LLMs replace humans in A/B tests? Engineering blog post, August 2026.</w:t>
+        <w:t xml:space="preserve">Persson J, Schultzberg M, Ankargren S (2026) Statistical foundations of LLM-based A/B testing: A surrogacy framework for human causal inference. Preprint, arXiv:2606.17165.</w:t>
       </w:r>
     </w:p>
     <w:p>
@@ -9898,7 +9898,7 @@
           <w:sz w:val="24"/>
           <w:szCs w:val="24"/>
         </w:rPr>
-        <w:t xml:space="preserve">Synthetic Personas Preprint (2026) Do synthetic personas predict real audience response? A sim-to-real study where a no-persona baseline beats persona-based copy simulation. Preprint, arXiv:2609.25010. [author list to be completed]</w:t>
+        <w:t xml:space="preserve">Peng T, Gui G, Brucks M, et al. (2026) Digital twins are funhouse mirrors: Five systematic distortions. Preprint, arXiv:2509.19088.</w:t>
       </w:r>
     </w:p>
     <w:p>

</xml_diff>

<commit_message>
Add Figure 1 forest plot, embed in manuscript, rebuild submission bundle
Co-Authored-By: Claude Sonnet 5.5 <noreply@anthropic.com>
Claude-Session: https://claude.ai/code/session_01UvKcabfwJpaPKKhavR8Tdw
</commit_message>
<xml_diff>
--- a/ISR_Digital_Twins_v4_validity_regions.docx
+++ b/ISR_Digital_Twins_v4_validity_regions.docx
@@ -3613,7 +3613,7 @@
           <w:sz w:val="24"/>
           <w:szCs w:val="24"/>
         </w:rPr>
-        <w:t xml:space="preserve">The prediction that cue-based effects overshoot in canonical paradigms is not supported. Framing exceeded the human effect in only two of five models (it was extreme in one model, whose framing effect reached a standardized difference of about 6), and anchoring was on average below the human effect. The robustness check with demographics-only twins shows that the organ-donation overshoot depends on persona architecture: with demographics only, it holds in three of five models and the pooled difference is negative (−4.0 points). The attraction effect that was inflated in the exploratory simulations is near zero or negative for three of five models in C1 (persona summary: −0.19, −0.36, and −0.29 log odds against a human effect of 0.37), whereas two models overshoot (0.90 and 1.91). Effects in the fairness study differ in sign across models (Table 5).</w:t>
+        <w:t xml:space="preserve">The prediction that cue-based effects overshoot in canonical paradigms is not supported. Framing exceeded the human effect in only two of five models (it was extreme in one model, whose framing effect reached a standardized difference of about 6), and anchoring was on average below the human effect. The robustness check with demographics-only twins shows that the organ-donation overshoot depends on persona architecture: with demographics only, it holds in three of five models and the pooled difference is negative (−4.0 points). The attraction effect that was inflated in the exploratory simulations is near zero or negative for three of five models in C1 (persona summary: −0.19, −0.36, and −0.29 log odds against a human effect of 0.37), whereas two models overshoot (0.90 and 1.91). Effects in the fairness study differ in sign across models (Table 5). Figure 1 plots all effects, models, and architectures against the human benchmarks.</w:t>
       </w:r>
     </w:p>
     <w:p>
@@ -6383,6 +6383,76 @@
       <w:pPr>
         <w:spacing w:after="200"/>
       </w:pPr>
+    </w:p>
+    <w:p>
+      <w:pPr>
+        <w:keepNext/>
+        <w:spacing w:after="60" w:before="120"/>
+        <w:jc w:val="center"/>
+      </w:pPr>
+      <w:r>
+        <w:drawing>
+          <wp:inline distT="0" distB="0" distL="0" distR="0">
+            <wp:extent cx="4962525" cy="7048500"/>
+            <wp:effectExtent t="0" r="0" b="0" l="0"/>
+            <wp:docPr id="1" name="Figure1" descr="Forest plot of twin effects against human benchmarks for seven effects, five models, and three persona architectures" title="Forest plot"/>
+            <wp:cNvGraphicFramePr>
+              <a:graphicFrameLocks xmlns:a="http://schemas.openxmlformats.org/drawingml/2006/main" noChangeAspect="1"/>
+            </wp:cNvGraphicFramePr>
+            <a:graphic xmlns:a="http://schemas.openxmlformats.org/drawingml/2006/main">
+              <a:graphicData uri="http://schemas.openxmlformats.org/drawingml/2006/picture">
+                <pic:pic xmlns:pic="http://schemas.openxmlformats.org/drawingml/2006/picture">
+                  <pic:nvPicPr>
+                    <pic:cNvPr id="0" name="" descr=""/>
+                    <pic:cNvPicPr>
+                      <a:picLocks noChangeAspect="1" noChangeArrowheads="1"/>
+                    </pic:cNvPicPr>
+                  </pic:nvPicPr>
+                  <pic:blipFill>
+                    <a:blip r:embed="rId8" cstate="none"/>
+                    <a:srcRect/>
+                    <a:stretch>
+                      <a:fillRect/>
+                    </a:stretch>
+                  </pic:blipFill>
+                  <pic:spPr bwMode="auto">
+                    <a:xfrm>
+                      <a:off x="0" y="0"/>
+                      <a:ext cx="4962525" cy="7048500"/>
+                    </a:xfrm>
+                    <a:prstGeom prst="rect">
+                      <a:avLst/>
+                    </a:prstGeom>
+                  </pic:spPr>
+                </pic:pic>
+              </a:graphicData>
+            </a:graphic>
+          </wp:inline>
+        </w:drawing>
+      </w:r>
+    </w:p>
+    <w:p>
+      <w:pPr>
+        <w:spacing w:after="200" w:line="276"/>
+      </w:pPr>
+      <w:r>
+        <w:rPr>
+          <w:rFonts w:ascii="Times New Roman" w:cs="Times New Roman" w:eastAsia="Times New Roman" w:hAnsi="Times New Roman"/>
+          <w:b/>
+          <w:bCs/>
+          <w:sz w:val="22"/>
+          <w:szCs w:val="22"/>
+        </w:rPr>
+        <w:t xml:space="preserve">Figure 1. </w:t>
+      </w:r>
+      <w:r>
+        <w:rPr>
+          <w:rFonts w:ascii="Times New Roman" w:cs="Times New Roman" w:eastAsia="Times New Roman" w:hAnsi="Times New Roman"/>
+          <w:sz w:val="22"/>
+          <w:szCs w:val="22"/>
+        </w:rPr>
+        <w:t xml:space="preserve">Twin effects against public human benchmarks in the confirmatory twin study (C1). Each panel is one effect. Points are twin estimates, bars are 95% respondent-bootstrap intervals (600 simulated respondents per model and architecture), the grey band is the 95% interval of the human effect, and the black line is the human estimate. Estimates beyond the axis range are shown as triangles at the edge with their value.</w:t>
+      </w:r>
     </w:p>
     <w:p>
       <w:pPr>

</xml_diff>